<commit_message>
feat(uat-iso): complete all 6 UAT & ISO/IEC 25010 remediation items
</commit_message>
<xml_diff>
--- a/docs/IT_Expert_Testing_and_ISO25010_Evaluation_Form.docx
+++ b/docs/IT_Expert_Testing_and_ISO25010_Evaluation_Form.docx
@@ -378,7 +378,7 @@
                 <w:rFonts w:ascii="Calibri" w:hAnsi="Calibri"/>
                 <w:sz w:val="17"/>
               </w:rPr>
-              <w:t>Environment / Build: Cloud Production Portal (https://aegis-capstone.onrender.com) v1.0.0</w:t>
+              <w:t>Environment / Build: Cloud Production Portal (https://clsu.osa.scholarship) v1.0.0</w:t>
             </w:r>
           </w:p>
         </w:tc>
@@ -963,7 +963,7 @@
                 <w:rFonts w:ascii="Calibri" w:hAnsi="Calibri"/>
                 <w:sz w:val="16"/>
               </w:rPr>
-              <w:t>Inspect database storage of sensitive student profile fields (e.g. bank account numbers, guardian contact details, and student identities) in student_profiles.</w:t>
+              <w:t>Inspect database storage of sensitive student profile fields (e.g. institutional CLSU ID numbers, guardian contact details, and student emergency contacts under R.A. 10173 data minimization) in student_profiles.</w:t>
             </w:r>
           </w:p>
         </w:tc>
@@ -1053,7 +1053,7 @@
                 <w:rFonts w:ascii="Calibri" w:hAnsi="Calibri"/>
                 <w:sz w:val="16"/>
               </w:rPr>
-              <w:t>Compliant with NPC Data Privacy Act of 2012.</w:t>
+              <w:t>Compliant with NPC Data Privacy Act of 2012 (Data Minimization &amp; At-Rest Encryption).</w:t>
             </w:r>
           </w:p>
         </w:tc>

</xml_diff>